<commit_message>
Upload FINAL_PDP8_with_history.docx - 2026-04-13
</commit_message>
<xml_diff>
--- a/reports/2026-04-13/FINAL_PDP8_with_history.docx
+++ b/reports/2026-04-13/FINAL_PDP8_with_history.docx
@@ -44,14 +44,1218 @@
         <w:pStyle w:val="Heading1"/>
       </w:pPr>
       <w:r>
-        <w:t>2. 이번 주 관련 뉴스 (0건)</w:t>
+        <w:t>2. 이번 주 관련 뉴스 (19건)</w:t>
       </w:r>
     </w:p>
     <w:p>
       <w:r>
-        <w:t>이번 주 매칭된 기사가 없습니다.</w:t>
+        <w:rPr>
+          <w:b/>
+          <w:sz w:val="22"/>
+        </w:rPr>
+        <w:t>[1] National Power Development Plan VIII (PDP-8) - Vntpa</w:t>
       </w:r>
     </w:p>
+    <w:p>
+      <w:r>
+        <w:t>🔗 URL: https://www.vntpa.org/pdp8-en</w:t>
+      </w:r>
+    </w:p>
+    <w:p>
+      <w:r>
+        <w:t xml:space="preserve">📅 발행일: </w:t>
+      </w:r>
+    </w:p>
+    <w:p>
+      <w:r>
+        <w:t xml:space="preserve">📰 출처: </w:t>
+      </w:r>
+    </w:p>
+    <w:p>
+      <w:r>
+        <w:t>🏷️ 섹터: Power &amp; Energy | Province: National / Unspecified</w:t>
+      </w:r>
+    </w:p>
+    <w:p>
+      <w:r>
+        <w:t>🎯 매칭 점수: 3 점 (Medium Relevance)</w:t>
+      </w:r>
+    </w:p>
+    <w:p>
+      <w:r>
+        <w:t>📝 요약 (한국어):</w:t>
+      </w:r>
+    </w:p>
+    <w:p>
+      <w:pPr>
+        <w:ind w:left="720"/>
+      </w:pPr>
+      <w:r>
+        <w:t>## [https://www.vntpa.org/pdp8-en](https://www.vntpa.org/pdp8-en)</w:t>
+        <w:br/>
+        <w:br/>
+        <w:t>### Document Overview</w:t>
+        <w:br/>
+        <w:br/>
+        <w:t>This document outlines the official approval and detailed contents of Vietnam's National Power Development Plan for 2021-2030 (PDP8), focusing on energy security, renewable energy transition, and grid modernization.</w:t>
+        <w:br/>
+        <w:br/>
+        <w:t>### Question: 이 베트남 인프라 뉴스 기사를 한국어로 2-3문장으로 요약하세요. 섹터: Power &amp; Energy, 관련 마스터플랜: VN-PWR-PDP8, VN-EV-2030</w:t>
+        <w:br/>
+        <w:t>verbatim: Article 1. To approve the National Power Development Plan for the 2021 - 2030 period, with a vision to 2050 (NPDP 8)... To ensure national energy security for socio-economic development, industrialization, and modernization. To successfully carry out just energy transition in conjunction with modernizing electricity generation, establishing smart electricity grid, managing advanced power systems towards the green transition, emissions reduction, and scientific and technological development.</w:t>
+        <w:br/>
+        <w:t>answer: 베트남 정부는 2030년까지의 국가 전력 개발 계획과 2050년 비전을 담은 제8차 국가전력개발계획(PDP8)을 공식 승인하였습니다. 이 계획은 에너지 안보 확보와 경제 성장을 목표로 하며, 특히 화석 연료 의존도를 낮추고 풍력, 태양광 등 재생 에너지 비중을 2050년까지 최대 71.5%로 확대하는 녹색 전환과 탄소 중립 실현을 핵심으로 합니다. 또한, 스마트 그리드 구축과 지역 간 전력망 연결을 통해 에너지 산업 생태계를 현대화하고 신에너지 수출 가능성을 열어두는 포괄적인 에너지 전략을 제시하고 있습니다.</w:t>
+        <w:br/>
+        <w:br/>
+        <w:t>Source: [www.vntpa.org](https://www.vntpa.org/pdp8-en)</w:t>
+      </w:r>
+    </w:p>
+    <w:p/>
+    <w:p>
+      <w:r>
+        <w:rPr>
+          <w:b/>
+          <w:sz w:val="22"/>
+        </w:rPr>
+        <w:t>[2] Vietnam's Eighth National Power Development Plan (PDP VIII) - PwC</w:t>
+      </w:r>
+    </w:p>
+    <w:p>
+      <w:r>
+        <w:t>🔗 URL: https://www.pwc.com/vn/en/publications/vietnam-publications/pdp8-insights.html</w:t>
+      </w:r>
+    </w:p>
+    <w:p>
+      <w:r>
+        <w:t xml:space="preserve">📅 발행일: </w:t>
+      </w:r>
+    </w:p>
+    <w:p>
+      <w:r>
+        <w:t xml:space="preserve">📰 출처: </w:t>
+      </w:r>
+    </w:p>
+    <w:p>
+      <w:r>
+        <w:t>🏷️ 섹터: Power &amp; Energy | Province: National / Unspecified</w:t>
+      </w:r>
+    </w:p>
+    <w:p>
+      <w:r>
+        <w:t>🎯 매칭 점수: 2 점 (Medium Relevance)</w:t>
+      </w:r>
+    </w:p>
+    <w:p>
+      <w:r>
+        <w:t>📝 요약 (한국어):</w:t>
+      </w:r>
+    </w:p>
+    <w:p>
+      <w:pPr>
+        <w:ind w:left="720"/>
+      </w:pPr>
+      <w:r>
+        <w:t>## [https://www.pwc.com/vn/en/publications/vietnam-publications/pdp8-insights.html](https://www.pwc.com/vn/en/publications/vietnam-publications/pdp8-insights.html)</w:t>
+        <w:br/>
+        <w:br/>
+        <w:t>### Document Overview</w:t>
+        <w:br/>
+        <w:br/>
+        <w:t>This article analyzes Vietnam's Power Development Plan VIII (PDP8), detailing the strategic shift toward renewables, required investment of $700 billion by 2050, and implications for energy sector investors.</w:t>
+        <w:br/>
+        <w:br/>
+        <w:t>### Question: 이 베트남 인프라 뉴스 기사를 한국어로 2-3문장으로 요약하세요. 섹터: Power &amp; Energy, 관련 마스터플랜: VN-PWR-PDP8, VN-EV-2030</w:t>
+        <w:br/>
+        <w:t>verbatim: The market has welcomed the long-awaited PDP VIII, approved in late May of this year, which provides an ambitious plan through 2030 with a vision towards 2050... PDP VIII presents an ambitious shift for Vietnam’s generation mix away from coal, and heavily weighted towards in renewables and new technologies such as battery storage, hydrogen, and ammonia... This amounts to a roughly 2x projected growth to 150 GW in installed capacity by 2030, and 500 GW by 2050. Nearly 700 billion USD in investment would be required over the next three decades.</w:t>
+        <w:br/>
+        <w:t>answer: 베트남 정부가 승인한 제8차 국가전력개발계획(PDP8)은 2050년 넷제로 달성을 위해 석탄 화력 발전을 줄이고 재생에너지, 수소, 암모니아 및 배터리 저장 시스템(BESS)으로의 과감한 전환을 골자로 하고 있습니다. 이 계획에 따라 베트남은 2030년까지 발전 설비 용량을 150GW로 확충하고 2050년까지 500GW 확대를 목표로 하고 있으며, 이를 위해 향후 30년간 약 7,000억 달러 규모의 막대한 투자가 필요할 것으로 전망됩니다. 이번 마스터플랜 확정은 에너지 섹터의 불확실성을 해소하고 투자자들에게 구체적인 우선순위와 상업적 기회를 제공하는 중요한 이정표가 될 것입니다.</w:t>
+        <w:br/>
+        <w:br/>
+        <w:t>Source: [www.pwc.com](https://www.pwc.com/vn/en/publications/vietnam-publications/pdp8-insights.html)</w:t>
+      </w:r>
+    </w:p>
+    <w:p/>
+    <w:p>
+      <w:r>
+        <w:rPr>
+          <w:b/>
+          <w:sz w:val="22"/>
+        </w:rPr>
+        <w:t>[3] Vietnam's Eight National Power Development Plan (PDP8)</w:t>
+      </w:r>
+    </w:p>
+    <w:p>
+      <w:r>
+        <w:t>🔗 URL: https://greenfdc.org/vietnams-eight-national-power-development-plan-pdp8/</w:t>
+      </w:r>
+    </w:p>
+    <w:p>
+      <w:r>
+        <w:t>📅 발행일: Jun 5, 2023</w:t>
+      </w:r>
+    </w:p>
+    <w:p>
+      <w:r>
+        <w:t xml:space="preserve">📰 출처: </w:t>
+      </w:r>
+    </w:p>
+    <w:p>
+      <w:r>
+        <w:t>🏷️ 섹터: Power &amp; Energy | Province: National / Unspecified</w:t>
+      </w:r>
+    </w:p>
+    <w:p>
+      <w:r>
+        <w:t>🎯 매칭 점수: 5 점 (Medium Relevance)</w:t>
+      </w:r>
+    </w:p>
+    <w:p>
+      <w:r>
+        <w:t>📝 요약 (한국어):</w:t>
+      </w:r>
+    </w:p>
+    <w:p>
+      <w:pPr>
+        <w:ind w:left="720"/>
+      </w:pPr>
+      <w:r>
+        <w:t>## [https://greenfdc.org/vietnams-eight-national-power-development-plan-pdp8/](https://greenfdc.org/vietnams-eight-national-power-development-plan-pdp8/)</w:t>
+        <w:br/>
+        <w:br/>
+        <w:t>### Document Overview</w:t>
+        <w:br/>
+        <w:br/>
+        <w:t>The article analyzes Vietnam's PDP8, highlighting the strategic shift toward renewable energy, the phased decommissioning of coal plants by 2050, and the investment challenges ahead.</w:t>
+        <w:br/>
+        <w:br/>
+        <w:t>### Question: 이 베트남 인프라 뉴스 기사를 한국어로 2-3문장으로 요약하세요. 섹터: Power &amp; Energy, 관련 마스터플랜: VN-PWR-PDP8, VN-EV-2030</w:t>
+        <w:br/>
+        <w:t>verbatim: On May 15, 2023, the Vietnamese government released Vietnams Eight Power Development Plan (PDP8) for the period of 2021-2030, with a vision to 2050. The PDP8 represents a paradigm shift in Vietnams energy sector away from carbon intensive fossil fuels towards clean energy. In 2030, wind, solar, hydropower and biomass will provide 48% of Vietnams installed capacity, this share will rise to around 63% in 2050.</w:t>
+        <w:br/>
+        <w:t>answer: 베트남 정부는 2030년까지의 에너지 믹스와 국가 송전망 계획을 담은 제8차 국가전력개발계획(PDP8)을 확정하여 화석 연료 중심에서 재생 에너지 중심으로의 전환을 본격화했습니다. 이 계획에 따라 약 13GW의 석탄 화력 발전 프로젝트가 취소되고 2050년까지 모든 석탄 발전소의 연료 전환 또는 폐쇄가 추진되며, 2050년에는 태양광과 풍력이 주요 에너지원이 될 전망입니다. 섹터: Power &amp; Energy, 마스터플랜: VN-PWR-PDP8.</w:t>
+        <w:br/>
+        <w:br/>
+        <w:t>Source: [greenfdc.org](https://greenfdc.org/vietnams-eight-national-power-development-plan-pdp8/)</w:t>
+      </w:r>
+    </w:p>
+    <w:p/>
+    <w:p>
+      <w:r>
+        <w:rPr>
+          <w:b/>
+          <w:sz w:val="22"/>
+        </w:rPr>
+        <w:t>[4] Vietnam Revised Power Development Plan VIII</w:t>
+      </w:r>
+    </w:p>
+    <w:p>
+      <w:r>
+        <w:t>🔗 URL: https://www.trade.gov/market-intelligence/vietnam-revised-power-development-plan-viii</w:t>
+      </w:r>
+    </w:p>
+    <w:p>
+      <w:r>
+        <w:t>📅 발행일: Aug 22, 2025</w:t>
+      </w:r>
+    </w:p>
+    <w:p>
+      <w:r>
+        <w:t xml:space="preserve">📰 출처: </w:t>
+      </w:r>
+    </w:p>
+    <w:p>
+      <w:r>
+        <w:t>🏷️ 섹터: Power &amp; Energy | Province: National / Unspecified</w:t>
+      </w:r>
+    </w:p>
+    <w:p>
+      <w:r>
+        <w:t>🎯 매칭 점수: 3 점 (Medium Relevance)</w:t>
+      </w:r>
+    </w:p>
+    <w:p>
+      <w:r>
+        <w:t>📝 요약 (한국어):</w:t>
+      </w:r>
+    </w:p>
+    <w:p>
+      <w:pPr>
+        <w:ind w:left="720"/>
+      </w:pPr>
+      <w:r>
+        <w:t>## [https://www.trade.gov/market-intelligence/vietnam-revised-power-development-plan-viii](https://www.trade.gov/market-intelligence/vietnam-revised-power-development-plan-viii)</w:t>
+        <w:br/>
+        <w:br/>
+        <w:t>### Document Overview</w:t>
+        <w:br/>
+        <w:br/>
+        <w:t>This page is a placeholder or an introductory guide for the ITA's Global Business Navigator Chatbot, rather than the specific market intelligence report on Vietnam's Power Development Plan VIII.</w:t>
+        <w:br/>
+        <w:br/>
+        <w:t>Source: [www.trade.gov](https://www.trade.gov/market-intelligence/vietnam-revised-power-development-plan-viii)</w:t>
+      </w:r>
+    </w:p>
+    <w:p/>
+    <w:p>
+      <w:r>
+        <w:rPr>
+          <w:b/>
+          <w:sz w:val="22"/>
+        </w:rPr>
+        <w:t>[5] Vietnam's Power Development Plan 8 (PDP8) - Speeda ASEAN</w:t>
+      </w:r>
+    </w:p>
+    <w:p>
+      <w:r>
+        <w:t>🔗 URL: https://sea.ub-speeda.com/asean-insights/trend-reports/vietnams-pdp8/</w:t>
+      </w:r>
+    </w:p>
+    <w:p>
+      <w:r>
+        <w:t xml:space="preserve">📅 발행일: </w:t>
+      </w:r>
+    </w:p>
+    <w:p>
+      <w:r>
+        <w:t xml:space="preserve">📰 출처: </w:t>
+      </w:r>
+    </w:p>
+    <w:p>
+      <w:r>
+        <w:t>🏷️ 섹터: Power &amp; Energy | Province: National / Unspecified</w:t>
+      </w:r>
+    </w:p>
+    <w:p>
+      <w:r>
+        <w:t>🎯 매칭 점수: 4 점 (Medium Relevance)</w:t>
+      </w:r>
+    </w:p>
+    <w:p>
+      <w:r>
+        <w:t>📝 요약 (한국어):</w:t>
+      </w:r>
+    </w:p>
+    <w:p>
+      <w:pPr>
+        <w:ind w:left="720"/>
+      </w:pPr>
+      <w:r>
+        <w:t>## [https://sea.ub-speeda.com/asean-insights/trend-reports/vietnams-pdp8/](https://sea.ub-speeda.com/asean-insights/trend-reports/vietnams-pdp8/)</w:t>
+        <w:br/>
+        <w:br/>
+        <w:t>### Document Overview</w:t>
+        <w:br/>
+        <w:br/>
+        <w:t>This article analyzes Vietnam's Power Development Plan 8 (PDP8), detailing the strategic shift toward renewable energy (solar, wind) and the regulatory/infrastructural challenges facing the transition.</w:t>
+        <w:br/>
+        <w:br/>
+        <w:t>### Question: 이 베트남 인프라 뉴스 기사를 한국어로 2-3문장으로 요약하세요. 섹터: Power &amp; Energy, 관련 마스터플랜: VN-PWR-PDP8, VN-EV-2030</w:t>
+        <w:br/>
+        <w:t>verbatim: Vietnam’s Power Development Plan 8 (PDP8) stands as a seminal policy document, articulating a profound strategic shift towards accelerating the nation’s transition from a fossil fuel-dependent energy landscape to one dominated by renewables... Approved in May 2023, this comprehensive sectoral development plan spans the period 2021-2030, with an ambitious vision extending to 2050... The commitment to net-zero by 2050 has been a primary catalyst for the iterative revisions and ratifications of PDP8.</w:t>
+        <w:br/>
+        <w:t>answer: 베트남의 제8차 국가전력개발계획(PDP8)은 2050년 탄소중립 달성을 목표로 화석 연료 중심에서 재생에너지 중심으로의 에너지 전환을 가속화하는 핵심 전략입니다. 이 계획은 태양광, 풍력, 에너지 저장 시스템(BESS) 분야의 투자를 장려하고 직접전력구매계약(DPPA) 등 시장 자유화 조치를 포함하고 있으나, 낮은 가격 체계와 송전망 부족 문제는 여전히 해결해야 할 과제로 남아있습니다.</w:t>
+        <w:br/>
+        <w:br/>
+        <w:t>Source: [sea.ub-speeda.com](https://sea.ub-speeda.com/asean-insights/trend-reports/vietnams-pdp8/)</w:t>
+      </w:r>
+    </w:p>
+    <w:p/>
+    <w:p>
+      <w:r>
+        <w:rPr>
+          <w:b/>
+          <w:sz w:val="22"/>
+        </w:rPr>
+        <w:t>[6] Vietnam Approves Power Development Plan for Cleaner Fuels</w:t>
+      </w:r>
+    </w:p>
+    <w:p>
+      <w:r>
+        <w:t>🔗 URL: https://www.whitecase.com/insight-alert/vietnam-approves-power-development-plan-cleaner-fuels</w:t>
+      </w:r>
+    </w:p>
+    <w:p>
+      <w:r>
+        <w:t>📅 발행일: May 29, 2023</w:t>
+      </w:r>
+    </w:p>
+    <w:p>
+      <w:r>
+        <w:t xml:space="preserve">📰 출처: </w:t>
+      </w:r>
+    </w:p>
+    <w:p>
+      <w:r>
+        <w:t>🏷️ 섹터: Power &amp; Energy | Province: National / Unspecified</w:t>
+      </w:r>
+    </w:p>
+    <w:p>
+      <w:r>
+        <w:t>🎯 매칭 점수: 4 점 (Medium Relevance)</w:t>
+      </w:r>
+    </w:p>
+    <w:p>
+      <w:r>
+        <w:t>📝 요약 (한국어):</w:t>
+      </w:r>
+    </w:p>
+    <w:p>
+      <w:pPr>
+        <w:ind w:left="720"/>
+      </w:pPr>
+      <w:r>
+        <w:t>## [https://www.whitecase.com/insight-alert/vietnam-approves-power-development-plan-cleaner-fuels](https://www.whitecase.com/insight-alert/vietnam-approves-power-development-plan-cleaner-fuels)</w:t>
+        <w:br/>
+        <w:br/>
+        <w:t>### Document Overview</w:t>
+        <w:br/>
+        <w:br/>
+        <w:t>The article details Vietnam's newly approved Power Development Plan VIII (PDP8), which aims for energy transition, carbon neutrality by 2050, and massive investment in wind and LNG infrastructure.</w:t>
+        <w:br/>
+        <w:br/>
+        <w:t>### Question: 이 베트남 인프라 뉴스 기사를 한국어로 2-3문장으로 요약하세요. 섹터: Power &amp; Energy, 관련 마스터플랜: VN-PWR-PDP8, VN-GAS-PDP8, VN-EV-2030</w:t>
+        <w:br/>
+        <w:t>verbatim: On May 15, 2023, after two years of consultation with public and private stakeholders and 12 draft plans, Prime Minister Pham Minh Chinh approved Vietnam's PDP8 as part of Vietnam's National Electricity Development Plan 2021 30. PDP8 calls for significant expansion of the country's electricity grid, more than doubling its capacity from 69 GW in 2020 to 150 GW by 2030, and set energy transition goals for achieving carbon neutrality by 2050. Much of the expansion is slated to come from investments in offshore wind facilities and LNG-supplied natural gas power plants.</w:t>
+        <w:br/>
+        <w:t>answer: 베트남 정부는 2030년까지 발전 용량을 150GW로 두 배 이상 확대하고 2050년 탄소 중립 달성을 목표로 하는 제8차 국가전력개발계획(PDP8)을 최종 승인했습니다. 이 계획은 석탄 화력 발전의 단계적 폐지와 함께 해상 풍력 및 LNG 발전 시설 확대를 핵심으로 하며, 이를 위해 2030년까지 약 1,347억 달러 규모의 국내외 투자가 투입될 예정입니다. 아울러 재생에너지 비중을 2050년까지 67.5%로 높이기 위한 법적 개정 및 송전망 인프라 개선이 병행될 계획입니다.</w:t>
+        <w:br/>
+        <w:br/>
+        <w:t>Source: [www.whitecase.com](https://www.whitecase.com/insight-alert/vietnam-approves-power-development-plan-cleaner-fuels)</w:t>
+      </w:r>
+    </w:p>
+    <w:p/>
+    <w:p>
+      <w:r>
+        <w:rPr>
+          <w:b/>
+          <w:sz w:val="22"/>
+        </w:rPr>
+        <w:t>[7] Vietnam's National Power Development Plan For LNG Power Plants</w:t>
+      </w:r>
+    </w:p>
+    <w:p>
+      <w:r>
+        <w:t>🔗 URL: https://www.lexology.com/library/detail.aspx?g=442af86b-e1a3-4c54-a16c-5649aefaaa5d</w:t>
+      </w:r>
+    </w:p>
+    <w:p>
+      <w:r>
+        <w:t>📅 발행일: May 8, 2025</w:t>
+      </w:r>
+    </w:p>
+    <w:p>
+      <w:r>
+        <w:t xml:space="preserve">📰 출처: </w:t>
+      </w:r>
+    </w:p>
+    <w:p>
+      <w:r>
+        <w:t>🏷️ 섹터: Power &amp; Energy | Province: Nam Dinh</w:t>
+      </w:r>
+    </w:p>
+    <w:p>
+      <w:r>
+        <w:t>🎯 매칭 점수: 4 점 (Medium Relevance)</w:t>
+      </w:r>
+    </w:p>
+    <w:p>
+      <w:r>
+        <w:t>📝 요약 (한국어):</w:t>
+      </w:r>
+    </w:p>
+    <w:p>
+      <w:pPr>
+        <w:ind w:left="720"/>
+      </w:pPr>
+      <w:r>
+        <w:t>## [https://www.lexology.com/library/detail.aspx?g=442af86b-e1a3-4c54-a16c-5649aefaaa5d](https://www.lexology.com/library/detail.aspx?g=442af86b-e1a3-4c54-a16c-5649aefaaa5d)</w:t>
+        <w:br/>
+        <w:br/>
+        <w:t>### Document Overview</w:t>
+        <w:br/>
+        <w:br/>
+        <w:t>The article discusses Vietnam's Amended National Power Development Plan (PDP8) and the new regulatory framework (Decree 56) aimed at accelerating LNG power projects to meet the country's growing electricity demand and net-zero goals.</w:t>
+        <w:br/>
+        <w:br/>
+        <w:t>### Question: 이 베트남 인프라 뉴스 기사를 한국어로 2-3문장으로 요약하세요. 섹터: Power &amp; Energy, 관련 마스터플랜: VN-PWR-PDP8, VN-GAS-PDP8, VN-EV-2030</w:t>
+        <w:br/>
+        <w:t>verbatim: On April 15, 2025 the Prime Minister issued a new decision (Decision 768) approving the amended National Power Plan (“Amended PDP8”) to address the actual implementation and changes of circumstances. ... Under the Plan Vietnam has five years (until 2030) to develop 15 LNG power plants. ... To address these challenges, the Government has recently issued Decree 56, which provides guidance on LNG project development. ... During the loan repayment period, at least 65% of the electricity output from LNG power plants can be sold to the national grid.</w:t>
+        <w:br/>
+        <w:t>answer: 베트남 정부는 수정된 제8차 국가전력개발계획(Amended PDP8)을 통해 2030년까지 15개의 LNG 발전소 건설을 추진하며, 총 발전 용량을 150,500MW까지 확대할 계획입니다. 이를 지원하기 위해 연료비 전가 메커니즘(FCPTM)과 최소 65%의 전력 구매 보장 등을 골자로 하는 법령(Decree 56)을 시행하여 프로젝트의 경제성과 은행 대출성(Bankability)을 높이고자 합니다. 이러한 조치는 지연되는 석탄 및 풍력 발전 프로젝트를 보완하고 2050년 넷제로 목표를 달성하기 위한 핵심적인 에너지 믹스 전환 전략의 일환입니다.</w:t>
+        <w:br/>
+        <w:br/>
+        <w:t>Source: [www.lexology.com](https://www.lexology.com/library/detail.aspx?g=442af86b-e1a3-4c54-a16c-5649aefaaa5d)</w:t>
+      </w:r>
+    </w:p>
+    <w:p/>
+    <w:p>
+      <w:r>
+        <w:rPr>
+          <w:b/>
+          <w:sz w:val="22"/>
+        </w:rPr>
+        <w:t>[8] Vietnam's latest power development plan focuses on expanding ...</w:t>
+      </w:r>
+    </w:p>
+    <w:p>
+      <w:r>
+        <w:t>🔗 URL: https://www.eia.gov/todayinenergy/detail.php?id=48176</w:t>
+      </w:r>
+    </w:p>
+    <w:p>
+      <w:r>
+        <w:t>📅 발행일: Jun 1, 2021</w:t>
+      </w:r>
+    </w:p>
+    <w:p>
+      <w:r>
+        <w:t xml:space="preserve">📰 출처: </w:t>
+      </w:r>
+    </w:p>
+    <w:p>
+      <w:r>
+        <w:t>🏷️ 섹터: Power &amp; Energy | Province: National / Unspecified</w:t>
+      </w:r>
+    </w:p>
+    <w:p>
+      <w:r>
+        <w:t>🎯 매칭 점수: 6 점 (Medium Relevance)</w:t>
+      </w:r>
+    </w:p>
+    <w:p>
+      <w:r>
+        <w:t>📝 요약 (한국어):</w:t>
+      </w:r>
+    </w:p>
+    <w:p>
+      <w:pPr>
+        <w:ind w:left="720"/>
+      </w:pPr>
+      <w:r>
+        <w:t>## [https://www.eia.gov/todayinenergy/detail.php?id=48176](https://www.eia.gov/todayinenergy/detail.php?id=48176)</w:t>
+        <w:br/>
+        <w:br/>
+        <w:t>### Document Overview</w:t>
+        <w:br/>
+        <w:br/>
+        <w:t>This article discusses Vietnam's draft Power Development Plan 8 (PDP 8) which aims to shift the energy mix from coal and hydro toward solar and wind, while prioritizing critical grid infrastructure upgrades.</w:t>
+        <w:br/>
+        <w:br/>
+        <w:t>### Question: 이 베트남 인프라 뉴스 기사를 한국어로 2-3문장으로 요약하세요. 섹터: Power &amp; Energy, 관련 마스터플랜: VN-PWR-PDP8, VN-EV-2030</w:t>
+        <w:br/>
+        <w:t>verbatim: In February 2021, the government of Vietnam released a draft of the country’s latest national power development plan, Power Development Plan 8 (PDP 8), for 2021 to 2030. The draft PDP 8 expands wind and solar capacity and increases their shares of the country’s generation mix. The draft PDP 8 also prioritizes enhancing grid infrastructure to ensure stable operation with a higher share of renewables.</w:t>
+        <w:br/>
+        <w:t>answer: 베트남 정부는 2021년부터 2030년까지를 아우르는 제8차 국가 전력개발계획(PDP 8) 초안을 통해 풍력 및 태양광 발전 용량을 대폭 확대하고 재생에너지 비중을 높일 계획입니다. 특히 낙후된 전력망 인프라 확충과 송전 병목 현상 해결을 최우선 과제로 삼아, 중남부 지역을 잇는 500kV 송전선 연장 등 전력망 현대화에 집중하고 있습니다. 이를 통해 석탄 화력 발전 의존도를 낮추고 급증하는 전력 수요와 탄소 배출 감소 목표를 동시에 달성하고자 합니다.</w:t>
+        <w:br/>
+        <w:br/>
+        <w:t>Source: [www.eia.gov](https://www.eia.gov/todayinenergy/detail.php?id=48176)</w:t>
+      </w:r>
+    </w:p>
+    <w:p/>
+    <w:p>
+      <w:r>
+        <w:rPr>
+          <w:b/>
+          <w:sz w:val="22"/>
+        </w:rPr>
+        <w:t>[9] Foreign investors threaten legal action against Vietnam over ...</w:t>
+      </w:r>
+    </w:p>
+    <w:p>
+      <w:r>
+        <w:t>🔗 URL: https://www.reuters.com/sustainability/boards-policy-regulation/foreign-investors-threaten-legal-action-against-vietnam-over-renewables-document-2026-03-12/</w:t>
+      </w:r>
+    </w:p>
+    <w:p>
+      <w:r>
+        <w:t>📅 발행일: Mar 12, 2026</w:t>
+      </w:r>
+    </w:p>
+    <w:p>
+      <w:r>
+        <w:t xml:space="preserve">📰 출처: </w:t>
+      </w:r>
+    </w:p>
+    <w:p>
+      <w:r>
+        <w:t>🏷️ 섹터: Power &amp; Energy | Province: National / Unspecified</w:t>
+      </w:r>
+    </w:p>
+    <w:p>
+      <w:r>
+        <w:t>🎯 매칭 점수: 3 점 (Medium Relevance)</w:t>
+      </w:r>
+    </w:p>
+    <w:p>
+      <w:r>
+        <w:t>📝 요약 (한국어):</w:t>
+      </w:r>
+    </w:p>
+    <w:p>
+      <w:pPr>
+        <w:ind w:left="720"/>
+      </w:pPr>
+      <w:r>
+        <w:t>## [https://www.reuters.com/sustainability/boards-policy-regulation/foreign-investors-threaten-legal-action-against-vietnam-over-renewables-document-2026-03-12/](https://www.reuters.com/sustainability/boards-policy-regulation/foreign-investors-threaten-legal-action-against-vietnam-over-renewables-document-2026-03-12/)</w:t>
+        <w:br/>
+        <w:br/>
+        <w:t>### Document Overview</w:t>
+        <w:br/>
+        <w:br/>
+        <w:t>This article discusses the legal threats from foreign chambers of commerce against the Vietnamese government regarding retroactive tariff cuts for 12GW of renewable energy projects.</w:t>
+        <w:br/>
+        <w:br/>
+        <w:t>### Question: 이 베트남 인프라 뉴스 기사를 한국어로 2-3문장으로 요약하세요. 섹터: Power &amp; Energy, 관련 마스터플랜: VN-PWR-PDP8</w:t>
+        <w:br/>
+        <w:t>verbatim: Foreign investors may take legal action if Vietnam does not fully pay electricity tariffs agreed with multiple wind and solar projects, according to a document signed by five chambers of commerce seen by Reuters. ... The retroactive change to tariffs, which took effect in January 2025, followed investigations into alleged abuses in accessing ⁠the preferential rates. ... The letter urges authorities to find an amicable solution to a dispute that the chambers said could lead to defaults and significant losses on multibillion-dollar investments in Vietnam's renewable energy sector.</w:t>
+        <w:br/>
+        <w:t>answer: 베트남 정부가 재생에너지(풍력·태양광) 프로젝트에 대해 약속했던 고정가격매입(FiT) 관찰을 소급 삭감하자, 유럽연합(EU)·일본·한국 등 5개국 상공회의소가 공동 서한을 통해 국제 분쟁 해결 절차를 포함한 법적 대응을 예고했습니다. 이번 갈등은 베트남 전력공사(EVN)의 누적 적자와 발전 용량 12GW 규모의 민간 투자 프로젝트들에 대한 단가 인하 시도에서 비롯되었으며, 이는 베트남 전력 개발 마스터플랜(PDP8) 추진 과정에서 신재생 에너지 분야의 대규모 외자 유치 및 신뢰도에 상당한 위험 요소로 작용하고 있습니다.</w:t>
+        <w:br/>
+        <w:br/>
+        <w:t>Source: [www.reuters.com](https://www.reuters.com/sustainability/boards-policy-regulation/foreign-investors-threaten-legal-action-against-vietnam-over-renewables-document-2026-03-12/)</w:t>
+      </w:r>
+    </w:p>
+    <w:p/>
+    <w:p>
+      <w:r>
+        <w:rPr>
+          <w:b/>
+          <w:sz w:val="22"/>
+        </w:rPr>
+        <w:t>[10] An alternative to urban solar energy | Vietnam Today - YouTube</w:t>
+      </w:r>
+    </w:p>
+    <w:p>
+      <w:r>
+        <w:t>🔗 URL: https://www.youtube.com/watch?v=bdfXnoZeULc</w:t>
+      </w:r>
+    </w:p>
+    <w:p>
+      <w:r>
+        <w:t>📅 발행일: 8 days ago</w:t>
+      </w:r>
+    </w:p>
+    <w:p>
+      <w:r>
+        <w:t xml:space="preserve">📰 출처: </w:t>
+      </w:r>
+    </w:p>
+    <w:p>
+      <w:r>
+        <w:t>🏷️ 섹터: Power &amp; Energy | Province: National / Unspecified</w:t>
+      </w:r>
+    </w:p>
+    <w:p>
+      <w:r>
+        <w:t>🎯 매칭 점수: 2 점 (Medium Relevance)</w:t>
+      </w:r>
+    </w:p>
+    <w:p>
+      <w:r>
+        <w:t>📝 요약 (한국어):</w:t>
+      </w:r>
+    </w:p>
+    <w:p>
+      <w:pPr>
+        <w:ind w:left="720"/>
+      </w:pPr>
+      <w:r>
+        <w:t>## [https://www.youtube.com/watch?v=bdfXnoZeULc](https://www.youtube.com/watch?v=bdfXnoZeULc)</w:t>
+        <w:br/>
+        <w:br/>
+        <w:t>### Document Overview</w:t>
+        <w:br/>
+        <w:br/>
+        <w:t>This video reports on Vietnam's commitment to net-zero emissions by 2050, focusing on renewable energy alternatives and infrastructure developments under PDP8.</w:t>
+        <w:br/>
+        <w:br/>
+        <w:t>### Question: 이 베트남 인프라 뉴스 기사를 한국어로 2-3문장으로 요약하세요. 섹터: Power &amp; Energy, 관련 마스터플랜: VN-PWR-PDP8</w:t>
+        <w:br/>
+        <w:t>verbatim: Prime Minister Phạm Minh Chính has reaffirmed Việt Nam's commitment to net-zero emissions by 2050 at COP26 earlier in 2026, prioritising renewable energy. ... An alternative to urban solar energy.</w:t>
+        <w:br/>
+        <w:t>answer: 베트남 정부는 제8차 국가전력개발계획(PDP8)에 따라 2050년 탄소중립 실현을 위해 재생에너지 보급을 최우선 과제로 추진하고 있습니다. 특히 도시 환경에 적합한 새로운 태양광 에너지 대안을 모색하며 에너지 전환 가속화를 위한 인프라 구축에 집중하고 있습니다.</w:t>
+        <w:br/>
+        <w:br/>
+        <w:t>Source: [www.youtube.com](https://www.youtube.com/watch?v=bdfXnoZeULc)</w:t>
+      </w:r>
+    </w:p>
+    <w:p/>
+    <w:p>
+      <w:r>
+        <w:rPr>
+          <w:b/>
+          <w:sz w:val="22"/>
+        </w:rPr>
+        <w:t>[11] Gusty growth: Vietnam's remarkable wind energy story - Eco-Business</w:t>
+      </w:r>
+    </w:p>
+    <w:p>
+      <w:r>
+        <w:t>🔗 URL: https://www.renewableenergyasia.org/2026/03/gusty-growth-vietnams-remarkable-wind.html</w:t>
+      </w:r>
+    </w:p>
+    <w:p>
+      <w:r>
+        <w:t>📅 발행일: Mar 20, 2026</w:t>
+      </w:r>
+    </w:p>
+    <w:p>
+      <w:r>
+        <w:t xml:space="preserve">📰 출처: </w:t>
+      </w:r>
+    </w:p>
+    <w:p>
+      <w:r>
+        <w:t>🏷️ 섹터: Power &amp; Energy | Province: National / Unspecified</w:t>
+      </w:r>
+    </w:p>
+    <w:p>
+      <w:r>
+        <w:t>🎯 매칭 점수: 2 점 (Medium Relevance)</w:t>
+      </w:r>
+    </w:p>
+    <w:p>
+      <w:r>
+        <w:t>📝 요약 (한국어):</w:t>
+      </w:r>
+    </w:p>
+    <w:p>
+      <w:pPr>
+        <w:ind w:left="720"/>
+      </w:pPr>
+      <w:r>
+        <w:t>## [https://www.renewableenergyasia.org/2026/03/gusty-growth-vietnams-remarkable-wind.html](https://www.renewableenergyasia.org/2026/03/gusty-growth-vietnams-remarkable-wind.html)</w:t>
+        <w:br/>
+        <w:br/>
+        <w:t>### Document Overview</w:t>
+        <w:br/>
+        <w:br/>
+        <w:t>The article analyzes the rapid growth of Vietnam's wind energy sector, which grew from 200 MW in 2019 to 1,700 MW in 2022, targeting 6,000 MW by 2030.</w:t>
+        <w:br/>
+        <w:br/>
+        <w:t>### Question: 이 베트남 인프라 뉴스 기사를 한국어로 2-3문장으로 요약하세요. 섹터: Power &amp; Energy, 관련 마스터플랜: VN-PWR-PDP8</w:t>
+        <w:br/>
+        <w:t>verbatim: Vietnam's total installed wind energy capacity reached approximately 1,700 megawatts (MW). This figure reflects a significant increase from just 200 MW in 2019... The government has set an ambitious target to achieve 6,000 MW of wind power capacity by 2030 as part of its broader strategy to enhance renewable energy sources. One of the key initiatives is the Feed-in Tariff (FiT) program, which was introduced to encourage investment in renewable energy projects.</w:t>
+        <w:br/>
+        <w:t>answer: 베트남은 전력개발계획(PDP8) 등 국가 에너지 전략에 따라 2030년까지 풍력 발전 용량을 6,000MW로 확대하기 위해 발전차액지원제도(FiT)와 같은 강력한 지원 정책을 시행하며 시장을 빠르게 확장하고 있습니다. 2022년 기준 풍력 설치 용량은 약 1,700MW로 2019년 대비 비약적으로 성장했으며, 빈투언 및 닌투언 지역의 대규모 프로젝트와 ADB 등 국제 금융 기구의 투자가 성장을 견인하고 있습니다. 다만, 변동성이 큰 풍력 에너지를 수용하기 위한 전력망 인프라 개선과 복잡한 규제 체계 정비는 향후 에너지 전환의 핵심 과제로 남아 있습니다.</w:t>
+        <w:br/>
+        <w:br/>
+        <w:t>Source: [www.renewableenergyasia.org](https://www.renewableenergyasia.org/2026/03/gusty-growth-vietnams-remarkable-wind.html)</w:t>
+      </w:r>
+    </w:p>
+    <w:p/>
+    <w:p>
+      <w:r>
+        <w:rPr>
+          <w:b/>
+          <w:sz w:val="22"/>
+        </w:rPr>
+        <w:t>[12] Bloomberg Businessweek Vietnam 02.2026 Featured Issue ...</w:t>
+      </w:r>
+    </w:p>
+    <w:p>
+      <w:r>
+        <w:t>🔗 URL: https://indochina-ep.com/bloomberg-businessweek-vietnam-02-2026-featured-issue-developing-renewable-energy-in-vietnam-discipline-is-more-important-than-speed-of-development/</w:t>
+      </w:r>
+    </w:p>
+    <w:p>
+      <w:r>
+        <w:t>📅 발행일: Feb 27, 2026</w:t>
+      </w:r>
+    </w:p>
+    <w:p>
+      <w:r>
+        <w:t xml:space="preserve">📰 출처: </w:t>
+      </w:r>
+    </w:p>
+    <w:p>
+      <w:r>
+        <w:t>🏷️ 섹터: Power &amp; Energy | Province: National / Unspecified</w:t>
+      </w:r>
+    </w:p>
+    <w:p>
+      <w:r>
+        <w:t>🎯 매칭 점수: 2 점 (Medium Relevance)</w:t>
+      </w:r>
+    </w:p>
+    <w:p>
+      <w:r>
+        <w:t>📝 요약 (한국어):</w:t>
+      </w:r>
+    </w:p>
+    <w:p>
+      <w:pPr>
+        <w:ind w:left="720"/>
+      </w:pPr>
+      <w:r>
+        <w:t>## [https://indochina-ep.com/bloomberg-businessweek-vietnam-02-2026-featured-issue-developing-renewable-energy-in-vietnam-discipline-is-more-important-than-speed-of-development/](https://indochina-ep.com/bloomberg-businessweek-vietnam-02-2026-featured-issue-developing-renewable-energy-in-vietnam-discipline-is-more-important-than-speed-of-development/)</w:t>
+        <w:br/>
+        <w:br/>
+        <w:t>### Document Overview</w:t>
+        <w:br/>
+        <w:br/>
+        <w:t>This article analyzes Vietnam's shift from rapid, subsidy-led renewable energy growth to a disciplined, market-based approach under PDP8 and DPPA frameworks.</w:t>
+        <w:br/>
+        <w:br/>
+        <w:t>### Question: 이 베트남 인프라 뉴스 기사를 한국어로 2-3문장으로 요약하세요. 섹터: Power &amp; Energy, 관련 마스터플랜: VN-PWR-PDP8, VN-EV-2030</w:t>
+        <w:br/>
+        <w:t>verbatim: Vietnam is not reversing course on renewable energy. It is correcting structural weaknesses created during an earlier phase of rapid, subsidy-driven growth... With the current PDP8(revised) and the DPPA in place, EVN has a chance to recoup its losses from the FiTs and invest in upgrading their grid and substations. Vietnam’s decision to move decisively away from FiTs toward market-based mechanisms signals policy consistency. It demonstrates a willingness to learn from past excesses and to prioritize long-term system stability over short-term volume.</w:t>
+        <w:br/>
+        <w:t>answer: 베트남은 과거 급격한 보조금(FiT) 중심의 성장에서 벗어나 제8차 국가전력개발계획(PDP8) 및 직접전력구매계약(DPPA)을 통해 시장 기반의 체계적인 에너지 전환을 추진하고 있습니다. 현재 진행 중인 재생에너지 프로젝트 검토는 정책 후퇴가 아닌 규정 준수를 위한 시장 기강 확립 과정이며, 이를 통해 전력망 안정성과 장기적인 투자 신뢰성을 확보하려 합니다. 결론적으로 베트남은 단순한 개발 속도보다 전력망 수용 능력과 시장 원리를 우선시하는 지속 가능한 재생에너지 생태계 구축에 집중하고 있습니다.</w:t>
+        <w:br/>
+        <w:br/>
+        <w:t>Source: [indochina-ep.com](https://indochina-ep.com/bloomberg-businessweek-vietnam-02-2026-featured-issue-developing-renewable-energy-in-vietnam-discipline-is-more-important-than-speed-of-development/)</w:t>
+      </w:r>
+    </w:p>
+    <w:p/>
+    <w:p>
+      <w:r>
+        <w:rPr>
+          <w:b/>
+          <w:sz w:val="22"/>
+        </w:rPr>
+        <w:t>[13] From boom to balance in Vietnam's clean energy transition - IEEFA</w:t>
+      </w:r>
+    </w:p>
+    <w:p>
+      <w:r>
+        <w:t>🔗 URL: https://ieefa.org/resources/boom-balance-vietnams-clean-energy-transition</w:t>
+      </w:r>
+    </w:p>
+    <w:p>
+      <w:r>
+        <w:t>📅 발행일: Jun 17, 2025</w:t>
+      </w:r>
+    </w:p>
+    <w:p>
+      <w:r>
+        <w:t xml:space="preserve">📰 출처: </w:t>
+      </w:r>
+    </w:p>
+    <w:p>
+      <w:r>
+        <w:t>🏷️ 섹터: Power &amp; Energy | Province: National / Unspecified</w:t>
+      </w:r>
+    </w:p>
+    <w:p>
+      <w:r>
+        <w:t>🎯 매칭 점수: 2 점 (Medium Relevance)</w:t>
+      </w:r>
+    </w:p>
+    <w:p>
+      <w:r>
+        <w:t>📝 요약 (한국어):</w:t>
+      </w:r>
+    </w:p>
+    <w:p>
+      <w:pPr>
+        <w:ind w:left="720"/>
+      </w:pPr>
+      <w:r>
+        <w:t>## [https://ieefa.org/resources/boom-balance-vietnams-clean-energy-transition](https://ieefa.org/resources/boom-balance-vietnams-clean-energy-transition)</w:t>
+        <w:br/>
+        <w:br/>
+        <w:t>### Document Overview</w:t>
+        <w:br/>
+        <w:br/>
+        <w:t>The article discusses Vietnam's transition from high-subsidy feed-in tariffs to more mature, cost-efficient energy policies like competitive auctions and DPPAs under the revised PDP8 framework to ensure financial sustainability.</w:t>
+        <w:br/>
+        <w:br/>
+        <w:t>### Question: 이 베트남 인프라 뉴스 기사를 한국어로 2-3문장으로 요약하세요. 섹터: Power &amp; Energy, 관련 마스터플랜: VN-PWR-PDP8, VN-EV-2030</w:t>
+        <w:br/>
+        <w:t>verbatim: Vietnam’s clean energy transformation was one of the fastest in Southeast Asia... The rapid, subsidy-driven expansion has exposed gaps in planning and financial sustainability – laying the groundwork that is now reshaping the sector’s trajectory. According to the revised Power Development Plan 8 (PDP8), the country aims to reach 73 gigawatts (GW) of installed solar power capacity and 38GW of onshore wind power by 2030... The targets for 2030 were significantly raised from the original 2023 plan – solar capacity was increased to between 46GW and 73GW, onshore wind to 26GW-38GW, and energy storage to 10GW-16GW.</w:t>
+        <w:br/>
+        <w:t>answer: 베트남은 급격한 재생에너지 확대에 따른 전력공사(EVN)의 재정적 부담을 해결하기 위해 고정가격매입제도(FiT)에서 경쟁 입찰 방식으로의 정책 전환을 추진하고 있습니다. 수정된 제8차 국가전력개발계획(PDP8)에 따라 2030년까지 태양광 73GW, 육상 풍력 38GW, 에너지 저장 장치 16GW로 목표를 상향 조정하였으며, 민간 직접전력구매계약(DPPA) 도입과 그리드 인프라 확충을 통해 에너지 전환의 지속 가능성을 확보할 계획입니다.</w:t>
+        <w:br/>
+        <w:br/>
+        <w:t>Source: [ieefa.org](https://ieefa.org/resources/boom-balance-vietnams-clean-energy-transition)</w:t>
+      </w:r>
+    </w:p>
+    <w:p/>
+    <w:p>
+      <w:r>
+        <w:rPr>
+          <w:b/>
+          <w:sz w:val="22"/>
+        </w:rPr>
+        <w:t>[14] Vietnam inaugurates USD1.4 billion LNG power plants in energy ...</w:t>
+      </w:r>
+    </w:p>
+    <w:p>
+      <w:r>
+        <w:t>🔗 URL: https://www.pvn.vn/sites/en/Pages/detail.aspx?NewsID=86c74ab3-40a9-4673-ad86-6dad1df16a3e</w:t>
+      </w:r>
+    </w:p>
+    <w:p>
+      <w:r>
+        <w:t>📅 발행일: Dec 15, 2025</w:t>
+      </w:r>
+    </w:p>
+    <w:p>
+      <w:r>
+        <w:t xml:space="preserve">📰 출처: </w:t>
+      </w:r>
+    </w:p>
+    <w:p>
+      <w:r>
+        <w:t>🏷️ 섹터: Power &amp; Energy | Province: National / Unspecified</w:t>
+      </w:r>
+    </w:p>
+    <w:p>
+      <w:r>
+        <w:t>🎯 매칭 점수: 2 점 (Medium Relevance)</w:t>
+      </w:r>
+    </w:p>
+    <w:p>
+      <w:r>
+        <w:t>📝 요약 (한국어):</w:t>
+      </w:r>
+    </w:p>
+    <w:p>
+      <w:pPr>
+        <w:ind w:left="720"/>
+      </w:pPr>
+      <w:r>
+        <w:t>## [https://www.pvn.vn/sites/en/Pages/detail.aspx?NewsID=86c74ab3-40a9-4673-ad86-6dad1df16a3e](https://www.pvn.vn/sites/en/Pages/detail.aspx?NewsID=86c74ab3-40a9-4673-ad86-6dad1df16a3e)</w:t>
+        <w:br/>
+        <w:br/>
+        <w:t>### Document Overview</w:t>
+        <w:br/>
+        <w:br/>
+        <w:t>This article reports on the inauguration of Vietnam's first $1.4 billion LNG power plants (Nhon Trach 3 &amp; 4) by Petrovietnam, highlighting their role in energy security and the country's net-zero goals.</w:t>
+        <w:br/>
+        <w:br/>
+        <w:t>### Question: 이 베트남 인프라 뉴스 기사를 한국어로 2-3문장으로 요약하세요. 섹터: Power &amp; Energy, 관련 마스터플랜: VN-PWR-PDP8, VN-GAS-PDP8</w:t>
+        <w:br/>
+        <w:t>verbatim: Vietnam has opened its first liquefied natural gas power plants, the twin Nhon Trach 3 and Nhon Trach 4 facilities in Dong Nai Province, at a cost of USD1.4 billion. Built by state energy giant Petrovietnam, the plants will generate more than nine billion kilowatt-hours annually with a combined capacity of 1 624 megawatts to support grid stability as renewable energy increases in the southern region. These plants are a crucial piece in strengthening national energy security and meeting the countrys fast and sustainable development requirements... and provide a template for 13 additional LNG projects outlined in the national power development plan.</w:t>
+        <w:br/>
+        <w:t>answer: 베트남 정부는 동나이성에서 총 1624MW 규모의 첫 액화천연가스(LNG) 발전소인 년짝(Nhon Trach) 3, 4호기를 공식 가동하며 국가 에너지 안보 강화 및 탄소 배출 감축에 나섰습니다. 이 프로젝트는 제8차 국가전력개발계획(PDP8)에 따라 추진되는 13개 추가 LNG 프로젝트의 모델이 될 것이며, 연간 90억 kWh 이상의 전력을 공급하여 남부 지역의 전력망 안정화와 고첨단 산업 수요를 뒷받침할 예정입니다.</w:t>
+        <w:br/>
+        <w:br/>
+        <w:t>Source: [www.pvn.vn](https://www.pvn.vn/sites/en/Pages/detail.aspx?NewsID=86c74ab3-40a9-4673-ad86-6dad1df16a3e)</w:t>
+      </w:r>
+    </w:p>
+    <w:p/>
+    <w:p>
+      <w:r>
+        <w:rPr>
+          <w:b/>
+          <w:sz w:val="22"/>
+        </w:rPr>
+        <w:t>[15] Vietnam-based energy company seeks smart-grid and power ...</w:t>
+      </w:r>
+    </w:p>
+    <w:p>
+      <w:r>
+        <w:t>🔗 URL: https://een.ec.europa.eu/partnering-opportunities/vietnam-based-energy-company-seeks-smart-grid-and-power-system-technology</w:t>
+      </w:r>
+    </w:p>
+    <w:p>
+      <w:r>
+        <w:t>📅 발행일: Mar 26, 2026</w:t>
+      </w:r>
+    </w:p>
+    <w:p>
+      <w:r>
+        <w:t xml:space="preserve">📰 출처: </w:t>
+      </w:r>
+    </w:p>
+    <w:p>
+      <w:r>
+        <w:t>🏷️ 섹터: Power &amp; Energy | Province: National / Unspecified</w:t>
+      </w:r>
+    </w:p>
+    <w:p>
+      <w:r>
+        <w:t>🎯 매칭 점수: 2 점 (Medium Relevance)</w:t>
+      </w:r>
+    </w:p>
+    <w:p>
+      <w:r>
+        <w:t>📝 요약 (한국어):</w:t>
+      </w:r>
+    </w:p>
+    <w:p>
+      <w:pPr>
+        <w:ind w:left="720"/>
+      </w:pPr>
+      <w:r>
+        <w:t>## [https://een.ec.europa.eu/partnering-opportunities/vietnam-based-energy-company-seeks-smart-grid-and-power-system-technology](https://een.ec.europa.eu/partnering-opportunities/vietnam-based-energy-company-seeks-smart-grid-and-power-system-technology)</w:t>
+        <w:br/>
+        <w:br/>
+        <w:t>### Document Overview</w:t>
+        <w:br/>
+        <w:br/>
+        <w:t>This page details a technology request from a Vietnamese energy firm seeking smart-grid and advanced power system solutions to enhance grid reliability and renewable energy integration.</w:t>
+        <w:br/>
+        <w:br/>
+        <w:t>### Question: 이 베트남 인프라 뉴스 기사를 한국어로 2-3문장으로 요약하세요. 섹터: Power &amp; Energy, 관련 마스터플랜: VN-PWR-PDP8</w:t>
+        <w:br/>
+        <w:t>verbatim: A Vietnam-based renewable energy and engineering company... is seeking international partners that can provide smart-grid and advanced technological solutions for transmission, distribution, and renewable energy systems. The company supports clients in achieving their sustainability goals through technology transfer, renewable energy development, engineering consulting, green energy solutions, reliability improvement, and project management services.</w:t>
+        <w:br/>
+        <w:t>answer: 2018년에 설립된 베트남의 신재생 에너지 및 엔지니어링 전문 기업이 전력망 효율성과 안정성을 높이기 위해 스마트 그리드 및 송배전 분야의 기술 협력 파트너를 찾고 있습니다. 이 기업은 베트남 제8차 국가 전력개발계획(PDP8)의 방향성에 맞춰 송배전망 자동화, 디지털 모니터링, 자산 관리 최적화 솔루션을 도입하여 현지 신재생 에너지 시스템의 신뢰성을 강화하고자 합니다. 이를 위해 글로벌 기업 및 연구소와 상업적 기술 지원 또는 기술 협력 계약을 희망하고 있습니다.</w:t>
+        <w:br/>
+        <w:br/>
+        <w:t>Source: [een.ec.europa.eu](https://een.ec.europa.eu/partnering-opportunities/vietnam-based-energy-company-seeks-smart-grid-and-power-system-technology)</w:t>
+      </w:r>
+    </w:p>
+    <w:p/>
+    <w:p>
+      <w:r>
+        <w:rPr>
+          <w:b/>
+          <w:sz w:val="22"/>
+        </w:rPr>
+        <w:t>[16] Vietnam: Power Sector Snapshot - Norton Rose Fulbright</w:t>
+      </w:r>
+    </w:p>
+    <w:p>
+      <w:r>
+        <w:t>🔗 URL: https://www.nortonrosefulbright.com/en/knowledge/publications/1d041eb0/vietnam-power-sector-snapshot</w:t>
+      </w:r>
+    </w:p>
+    <w:p>
+      <w:r>
+        <w:t xml:space="preserve">📅 발행일: </w:t>
+      </w:r>
+    </w:p>
+    <w:p>
+      <w:r>
+        <w:t xml:space="preserve">📰 출처: </w:t>
+      </w:r>
+    </w:p>
+    <w:p>
+      <w:r>
+        <w:t>🏷️ 섹터: Power &amp; Energy | Province: National / Unspecified</w:t>
+      </w:r>
+    </w:p>
+    <w:p>
+      <w:r>
+        <w:t>🎯 매칭 점수: 2 점 (Medium Relevance)</w:t>
+      </w:r>
+    </w:p>
+    <w:p>
+      <w:r>
+        <w:t>📝 요약 (한국어):</w:t>
+      </w:r>
+    </w:p>
+    <w:p>
+      <w:pPr>
+        <w:ind w:left="720"/>
+      </w:pPr>
+      <w:r>
+        <w:t>## [https://www.nortonrosefulbright.com/en/knowledge/publications/1d041eb0/vietnam-power-sector-snapshot](https://www.nortonrosefulbright.com/en/knowledge/publications/1d041eb0/vietnam-power-sector-snapshot)</w:t>
+        <w:br/>
+        <w:br/>
+        <w:t>### Document Overview</w:t>
+        <w:br/>
+        <w:br/>
+        <w:t>This article analyzes the 2025 revised Power Development Plan 8 (PDP8) in Vietnam, detailing targets for LNG, renewables, BESS, and nuclear power, while addressing regulatory changes like the new Electricity Law and bankability challenges.</w:t>
+        <w:br/>
+        <w:br/>
+        <w:t>### Question: 이 베트남 인프라 뉴스 기사를 한국어로 2-3문장으로 요약하세요. 섹터: Power &amp; Energy, 관련 마스터플랜: VN-PWR-PDP8</w:t>
+        <w:br/>
+        <w:t>verbatim: Vietnam’s power sector is expected to experience strong growth in 2026, driven by surging electricity demand, infrastructure expansion, and a major shift toward renewable energy. ... Decision No. 768/QD-TTg was issued on 15 April 2025 by the Prime Minister of Vietnam, which approved the revised National Power Development Plan VIII (PDP 8) for the period 2021–2030, with a vision to 2050.</w:t>
+        <w:br/>
+        <w:t>answer: 베트남은 급증하는 전력 수요에 대응하기 위해 2025년 4월 개정된 제8차 국가전력개발계획(PDP8)을 승인하고, 2030년까지 재생에너지, LNG 및 천연가스 발전 비중을 대폭 확대할 계획입니다. 특히 해상풍력, 태양광, 배터리 에너지 저장 장치(BESS)뿐만 아니라 중단되었던 원자력 발전 재개를 추진하며, 민간 직접 전력구매계약(DPPA) 도입과 전력망 현대화를 통해 에너지 안보와 2050년 넷제로 목표 달성을 도모하고 있습니다.</w:t>
+        <w:br/>
+        <w:br/>
+        <w:t>Source: [www.nortonrosefulbright.com](https://www.nortonrosefulbright.com/en/knowledge/publications/1d041eb0/vietnam-power-sector-snapshot)</w:t>
+      </w:r>
+    </w:p>
+    <w:p/>
+    <w:p>
+      <w:r>
+        <w:rPr>
+          <w:b/>
+          <w:sz w:val="22"/>
+        </w:rPr>
+        <w:t>[17] [PDF] Development of Vietnam Smart Grid Roadmap for period up to year ...</w:t>
+      </w:r>
+    </w:p>
+    <w:p>
+      <w:r>
+        <w:t>🔗 URL: https://www.energytransitionpartnership.org/wp-content/uploads/2025/07/SC-Development-of-Vietnam-Smart-Grid-Roadmap-for-period-up-to-year-2030-with-a-vision-to-2050.pdf</w:t>
+      </w:r>
+    </w:p>
+    <w:p>
+      <w:r>
+        <w:t xml:space="preserve">📅 발행일: </w:t>
+      </w:r>
+    </w:p>
+    <w:p>
+      <w:r>
+        <w:t xml:space="preserve">📰 출처: </w:t>
+      </w:r>
+    </w:p>
+    <w:p>
+      <w:r>
+        <w:t>🏷️ 섹터: Power &amp; Energy | Province: National / Unspecified</w:t>
+      </w:r>
+    </w:p>
+    <w:p>
+      <w:r>
+        <w:t>🎯 매칭 점수: 2 점 (Medium Relevance)</w:t>
+      </w:r>
+    </w:p>
+    <w:p>
+      <w:r>
+        <w:t>📝 요약 (한국어):</w:t>
+      </w:r>
+    </w:p>
+    <w:p>
+      <w:pPr>
+        <w:ind w:left="720"/>
+      </w:pPr>
+      <w:r>
+        <w:t>## [https://www.energytransitionpartnership.org/wp-content/uploads/2025/07/SC-Development-of-Vietnam-Smart-Grid-Roadmap-for-period-up-to-year-2030-with-a-vision-to-2050.pdf](https://www.energytransitionpartnership.org/wp-content/uploads/2025/07/SC-Development-of-Vietnam-Smart-Grid-Roadmap-for-period-up-to-year-2030-with-a-vision-to-2050.pdf)</w:t>
+        <w:br/>
+        <w:br/>
+        <w:t>### Document Overview</w:t>
+        <w:br/>
+        <w:br/>
+        <w:t>This report outlines the updated Smart Grid Roadmap for Vietnam to 2030 and 2050, focusing on integrating renewable energy, enhancing grid reliability, and supporting PDP8 objectives.</w:t>
+        <w:br/>
+        <w:br/>
+        <w:t>### Question: 이 베트남 인프라 뉴스 기사를 한국어로 2-3문장으로 요약하세요. 섹터: Power &amp; Energy, 관련 마스터플랜: VN-PWR-PDP8, VN-EV-2030</w:t>
+        <w:br/>
+        <w:t>verbatim: The objective of this report is to offer insights and recommendations to the development of a new roadmap that can effectively address the current and anticipated challenges facing the Vietnamese power grid for the period up to 2030, with a vision for 2050... This new roadmap is hence required to ensure the reliability and sustainability of the energy system, aligning with the objectives of Power Development Plan VIII and Viet Nam's commitment to achieving net-zero emissions... Key technologies that the Updated Smart Grid roadmap needs to consider are: Utility scale solar and rooftop solar, Onshore and offshore wind, Energy storage technologies, Electric Vehicle (EV) charging infrastructure.</w:t>
+        <w:br/>
+        <w:t>answer: 베트남은 제8차 국가전력개발계획(PDP8) 및 2050년 넷제로 목표에 발맞추어, 재생에너지 통합과 전력 계통의 안정성을 강화하기 위한 '2030 스마트 그리드 로드맵 및 2050 비전' 업데이트를 추진하고 있습니다. 본 로드맵은 전기차(EV) 충전 인프라 확충, 에너지 저장 장치(BESS) 도입, 지능형 원격 검침 인프라(AMI) 확대를 핵심 과제로 설정하여 현대적이고 효율적인 에너지 전환 시스템 구축을 목표로 합니다.</w:t>
+        <w:br/>
+        <w:br/>
+        <w:t>Source: [www.energytransitionpartnership.org](https://www.energytransitionpartnership.org/wp-content/uploads/2025/07/SC-Development-of-Vietnam-Smart-Grid-Roadmap-for-period-up-to-year-2030-with-a-vision-to-2050.pdf)</w:t>
+      </w:r>
+    </w:p>
+    <w:p/>
+    <w:p>
+      <w:r>
+        <w:rPr>
+          <w:b/>
+          <w:sz w:val="22"/>
+        </w:rPr>
+        <w:t>[18] VIETNAM-RESOLUTION 70-NQ/TW-2025 FACILITATES CAPITAL ...</w:t>
+      </w:r>
+    </w:p>
+    <w:p>
+      <w:r>
+        <w:t>🔗 URL: http://blogs.duanemorris.com/vietnam/2025/09/09/vietnam-resolution-70-nq-tw-2025-facilitates-capital-access-by-eliminating-institutional-barriers-in-vietnams-energy-sector/</w:t>
+      </w:r>
+    </w:p>
+    <w:p>
+      <w:r>
+        <w:t>📅 발행일: Sep 9, 2025</w:t>
+      </w:r>
+    </w:p>
+    <w:p>
+      <w:r>
+        <w:t xml:space="preserve">📰 출처: </w:t>
+      </w:r>
+    </w:p>
+    <w:p>
+      <w:r>
+        <w:t>🏷️ 섹터: Power &amp; Energy | Province: National / Unspecified</w:t>
+      </w:r>
+    </w:p>
+    <w:p>
+      <w:r>
+        <w:t>🎯 매칭 점수: 2 점 (Medium Relevance)</w:t>
+      </w:r>
+    </w:p>
+    <w:p>
+      <w:r>
+        <w:t>📝 요약 (한국어):</w:t>
+      </w:r>
+    </w:p>
+    <w:p>
+      <w:pPr>
+        <w:ind w:left="720"/>
+      </w:pPr>
+      <w:r>
+        <w:t>## [http://blogs.duanemorris.com/vietnam/2025/09/09/vietnam-resolution-70-nq-tw-2025-facilitates-capital-access-by-eliminating-institutional-barriers-in-vietnams-energy-sector/](http://blogs.duanemorris.com/vietnam/2025/09/09/vietnam-resolution-70-nq-tw-2025-facilitates-capital-access-by-eliminating-institutional-barriers-in-vietnams-energy-sector/)</w:t>
+        <w:br/>
+        <w:br/>
+        <w:t>### Document Overview</w:t>
+        <w:br/>
+        <w:br/>
+        <w:t>베트남의 새로운 에너지 전략인 결의안 제70-NQ/TW호에 대한 분석으로, 투자 장벽 제거, 재생에너지 확대, 원전 재개 및 인력 양성 계획을 다루고 있습니다.</w:t>
+        <w:br/>
+        <w:br/>
+        <w:t>### Question: 이 베트남 인프라 뉴스 기사를 한국어로 2-3문장으로 요약하세요. 섹터: Power &amp; Energy, 관련 마스터플랜: VN-PWR-PDP8, VN-REN-NPP-2050, VN-EV-2030</w:t>
+        <w:br/>
+        <w:t>verbatim: On August 20, 2025, Party General Secretary To Lam signed Resolution 70-NQ-TW of the Politburo, a strategic directive aimed at ensuring Vietnam’s national energy security through 2030, with a forward-looking perspective toward 2045... Key legal and policy highlights of Resolution 70 include: Facilitating Capital Inflows... Renewable Energy Prioritization... Nuclear Power Development: Urges expedited implementation of the Ninh Thuận 1 and 2 nuclear power plants by 2030–2035.</w:t>
+        <w:br/>
+        <w:t>answer: 베트남 공산당은 2030년 국가 에너지 안보 확보와 2045년 전망을 담은 결의안 제70-NQ/TW호를 발표하여 에너지 분야의 제도적 장벽을 제거하고 민간 및 외국인 투자를 활성화할 계획입니다. 이 결의안은 재생에너지 비중을 2030년까지 25~30%로 확대하고 닌투안 원자력 발전소 건설을 재개하는 등 에너지 믹스의 다변화와 효율성 향상을 목표로 합니다. 특히 전력구매계약(PPA) 집행 강화와 송전 가격 모델 도입을 통해 민간 자본의 유입을 촉진하고 탄소 중립 및 기후 변화 대응을 위한 지속 가능한 에너지 생태계 구축에 집중하고 있습니다.</w:t>
+        <w:br/>
+        <w:br/>
+        <w:t>Source: [blogs.duanemorris.com](http://blogs.duanemorris.com/vietnam/2025/09/09/vietnam-resolution-70-nq-tw-2025-facilitates-capital-access-by-eliminating-institutional-barriers-in-vietnams-energy-sector/)</w:t>
+      </w:r>
+    </w:p>
+    <w:p/>
+    <w:p>
+      <w:r>
+        <w:rPr>
+          <w:b/>
+          <w:sz w:val="22"/>
+        </w:rPr>
+        <w:t>[19] Smart Grids for Renewable Energy and Energy Efficiency - ESP</w:t>
+      </w:r>
+    </w:p>
+    <w:p>
+      <w:r>
+        <w:t>🔗 URL: https://www.esp.org.vn/project/smart-grids-for-renewable-energy-and-energy-efficiency/</w:t>
+      </w:r>
+    </w:p>
+    <w:p>
+      <w:r>
+        <w:t xml:space="preserve">📅 발행일: </w:t>
+      </w:r>
+    </w:p>
+    <w:p>
+      <w:r>
+        <w:t xml:space="preserve">📰 출처: </w:t>
+      </w:r>
+    </w:p>
+    <w:p>
+      <w:r>
+        <w:t>🏷️ 섹터: Power &amp; Energy | Province: National / Unspecified</w:t>
+      </w:r>
+    </w:p>
+    <w:p>
+      <w:r>
+        <w:t>🎯 매칭 점수: 2 점 (Medium Relevance)</w:t>
+      </w:r>
+    </w:p>
+    <w:p>
+      <w:r>
+        <w:t>📝 요약 (한국어):</w:t>
+      </w:r>
+    </w:p>
+    <w:p>
+      <w:pPr>
+        <w:ind w:left="720"/>
+      </w:pPr>
+      <w:r>
+        <w:t>## [https://www.esp.org.vn/project/smart-grids-for-renewable-energy-and-energy-efficiency/](https://www.esp.org.vn/project/smart-grids-for-renewable-energy-and-energy-efficiency/)</w:t>
+        <w:br/>
+        <w:br/>
+        <w:t>### Document Overview</w:t>
+        <w:br/>
+        <w:br/>
+        <w:t>This page details the SGREEE project in Vietnam, a €5 million initiative funded by Germany to modernize the national power grid for better renewable energy integration and energy efficiency through regulatory support, capacity building, and technology cooperation.</w:t>
+        <w:br/>
+        <w:br/>
+        <w:t>### Question: 이 베트남 인프라 뉴스 기사를 한국어로 2-3문장으로 요약하세요. 섹터: Power &amp; Energy, 관련 마스터플랜: VN-PWR-PDP8</w:t>
+        <w:br/>
+        <w:t>verbatim: The ‘Smart Grids for Renewable Energy and Energy Efficiency (SGREEE)’ project is supporting the Government of Viet Nam in the implementation of its Smart Grid Roadmap, which aims to promote the modernization and automation of the national power transmission and distribution system. Funded by BMZ, the project is working closely with ERAV to support experts of the Vietnamese power sector in developing a “Smart Grid”, i.e. the digitalization and flexibilization of the power supply system, which allows integration of an increasing share of renewable energies and supports greater energy efficiency.</w:t>
+        <w:br/>
+        <w:t>answer: 독일 BMZ의 지원을 받는 SGREEE 프로젝트는 베트남 전력 규제 당국(ERAV)과 협력하여 국가 전력망의 현대화 및 자동화를 추진하고 있습니다. 이 사업은 스마트 그리드 로드맵에 따라 전력 시스템의 디지털화와 유연성을 강화함으로써, 재생 에너지 비중 확대와 에너지 효율 향상을 목표로 법적 프레임워크 구축, 역량 강화 및 기술 협력을 진행했습니다. 이는 베트남 전력 개발 마스터플랜(PDP8)의 에너지 전환 목표를 뒷받침하는 핵심적인 인프라 고도화 활동으로 평가됩니다.</w:t>
+        <w:br/>
+        <w:br/>
+        <w:t>Source: [www.esp.org.vn](https://www.esp.org.vn/project/smart-grids-for-renewable-energy-and-energy-efficiency/)</w:t>
+      </w:r>
+    </w:p>
+    <w:p/>
     <w:p>
       <w:pPr>
         <w:pStyle w:val="Heading1"/>
@@ -62,7 +1266,7 @@
     </w:p>
     <w:p>
       <w:r>
-        <w:t>최근 4주 매칭 기사 수: 0 건 (이번 주)</w:t>
+        <w:t>최근 4주 매칭 기사 수: 19 건 (이번 주)</w:t>
       </w:r>
     </w:p>
     <w:p>
@@ -80,8 +1284,75 @@
       </w:r>
     </w:p>
     <w:p>
+      <w:pPr>
+        <w:pStyle w:val="ListBullet"/>
+      </w:pPr>
       <w:r>
-        <w:t>키워드 데이터 없음</w:t>
+        <w:t>• Power: 9회</w:t>
+      </w:r>
+    </w:p>
+    <w:p>
+      <w:pPr>
+        <w:pStyle w:val="ListBullet"/>
+      </w:pPr>
+      <w:r>
+        <w:t>• Development: 8회</w:t>
+      </w:r>
+    </w:p>
+    <w:p>
+      <w:pPr>
+        <w:pStyle w:val="ListBullet"/>
+      </w:pPr>
+      <w:r>
+        <w:t>• Plan: 7회</w:t>
+      </w:r>
+    </w:p>
+    <w:p>
+      <w:pPr>
+        <w:pStyle w:val="ListBullet"/>
+      </w:pPr>
+      <w:r>
+        <w:t>• Vietnam's: 7회</w:t>
+      </w:r>
+    </w:p>
+    <w:p>
+      <w:pPr>
+        <w:pStyle w:val="ListBullet"/>
+      </w:pPr>
+      <w:r>
+        <w:t>• Vietnam: 7회</w:t>
+      </w:r>
+    </w:p>
+    <w:p>
+      <w:pPr>
+        <w:pStyle w:val="ListBullet"/>
+      </w:pPr>
+      <w:r>
+        <w:t>• ...: 7회</w:t>
+      </w:r>
+    </w:p>
+    <w:p>
+      <w:pPr>
+        <w:pStyle w:val="ListBullet"/>
+      </w:pPr>
+      <w:r>
+        <w:t>• energy: 5회</w:t>
+      </w:r>
+    </w:p>
+    <w:p>
+      <w:pPr>
+        <w:pStyle w:val="ListBullet"/>
+      </w:pPr>
+      <w:r>
+        <w:t>• National: 4회</w:t>
+      </w:r>
+    </w:p>
+    <w:p>
+      <w:pPr>
+        <w:pStyle w:val="ListBullet"/>
+      </w:pPr>
+      <w:r>
+        <w:t>• for: 3회</w:t>
       </w:r>
     </w:p>
     <w:sectPr>

</xml_diff>